<commit_message>
Refactor Prototipos documentation: update "O que faz" to "Descrição" for consistency across sections.
</commit_message>
<xml_diff>
--- a/Prototipos/Prototipos.docx
+++ b/Prototipos/Prototipos.docx
@@ -775,37 +775,37 @@
           <w:rFonts w:ascii="Arial" w:hAnsi="Arial"/>
           <w:b/>
         </w:rPr>
-        <w:t>O</w:t>
-      </w:r>
-      <w:r>
-        <w:rPr>
-          <w:rFonts w:ascii="Arial" w:hAnsi="Arial"/>
-          <w:b/>
-          <w:spacing w:val="-3"/>
-        </w:rPr>
-        <w:t xml:space="preserve"> </w:t>
-      </w:r>
-      <w:r>
-        <w:rPr>
-          <w:rFonts w:ascii="Arial" w:hAnsi="Arial"/>
-          <w:b/>
-        </w:rPr>
-        <w:t>que</w:t>
-      </w:r>
-      <w:r>
-        <w:rPr>
-          <w:rFonts w:ascii="Arial" w:hAnsi="Arial"/>
-          <w:b/>
-          <w:spacing w:val="-3"/>
-        </w:rPr>
-        <w:t xml:space="preserve"> </w:t>
-      </w:r>
-      <w:r>
-        <w:rPr>
-          <w:rFonts w:ascii="Arial" w:hAnsi="Arial"/>
-          <w:b/>
-        </w:rPr>
-        <w:t>faz:</w:t>
+        <w:t>Descrição:</w:t>
+      </w:r>
+      <w:r>
+        <w:rPr>
+          <w:rFonts w:ascii="Arial" w:hAnsi="Arial"/>
+          <w:b/>
+          <w:spacing w:val="-3"/>
+        </w:rPr>
+        <w:t xml:space="preserve"/>
+      </w:r>
+      <w:r>
+        <w:rPr>
+          <w:rFonts w:ascii="Arial" w:hAnsi="Arial"/>
+          <w:b/>
+        </w:rPr>
+        <w:t/>
+      </w:r>
+      <w:r>
+        <w:rPr>
+          <w:rFonts w:ascii="Arial" w:hAnsi="Arial"/>
+          <w:b/>
+          <w:spacing w:val="-3"/>
+        </w:rPr>
+        <w:t xml:space="preserve"/>
+      </w:r>
+      <w:r>
+        <w:rPr>
+          <w:rFonts w:ascii="Arial" w:hAnsi="Arial"/>
+          <w:b/>
+        </w:rPr>
+        <w:t/>
       </w:r>
       <w:r>
         <w:rPr>
@@ -1270,37 +1270,37 @@
           <w:rFonts w:ascii="Arial" w:hAnsi="Arial"/>
           <w:b/>
         </w:rPr>
-        <w:t>O</w:t>
-      </w:r>
-      <w:r>
-        <w:rPr>
-          <w:rFonts w:ascii="Arial" w:hAnsi="Arial"/>
-          <w:b/>
-          <w:spacing w:val="-3"/>
-        </w:rPr>
-        <w:t xml:space="preserve"> </w:t>
-      </w:r>
-      <w:r>
-        <w:rPr>
-          <w:rFonts w:ascii="Arial" w:hAnsi="Arial"/>
-          <w:b/>
-        </w:rPr>
-        <w:t>que</w:t>
-      </w:r>
-      <w:r>
-        <w:rPr>
-          <w:rFonts w:ascii="Arial" w:hAnsi="Arial"/>
-          <w:b/>
-          <w:spacing w:val="-3"/>
-        </w:rPr>
-        <w:t xml:space="preserve"> </w:t>
-      </w:r>
-      <w:r>
-        <w:rPr>
-          <w:rFonts w:ascii="Arial" w:hAnsi="Arial"/>
-          <w:b/>
-        </w:rPr>
-        <w:t>faz:</w:t>
+        <w:t>Descrição:</w:t>
+      </w:r>
+      <w:r>
+        <w:rPr>
+          <w:rFonts w:ascii="Arial" w:hAnsi="Arial"/>
+          <w:b/>
+          <w:spacing w:val="-3"/>
+        </w:rPr>
+        <w:t xml:space="preserve"/>
+      </w:r>
+      <w:r>
+        <w:rPr>
+          <w:rFonts w:ascii="Arial" w:hAnsi="Arial"/>
+          <w:b/>
+        </w:rPr>
+        <w:t/>
+      </w:r>
+      <w:r>
+        <w:rPr>
+          <w:rFonts w:ascii="Arial" w:hAnsi="Arial"/>
+          <w:b/>
+          <w:spacing w:val="-3"/>
+        </w:rPr>
+        <w:t xml:space="preserve"/>
+      </w:r>
+      <w:r>
+        <w:rPr>
+          <w:rFonts w:ascii="Arial" w:hAnsi="Arial"/>
+          <w:b/>
+        </w:rPr>
+        <w:t/>
       </w:r>
       <w:r>
         <w:rPr>
@@ -1808,37 +1808,37 @@
           <w:rFonts w:ascii="Arial" w:hAnsi="Arial"/>
           <w:b/>
         </w:rPr>
-        <w:t>O</w:t>
-      </w:r>
-      <w:r>
-        <w:rPr>
-          <w:rFonts w:ascii="Arial" w:hAnsi="Arial"/>
-          <w:b/>
-          <w:spacing w:val="-3"/>
-        </w:rPr>
-        <w:t xml:space="preserve"> </w:t>
-      </w:r>
-      <w:r>
-        <w:rPr>
-          <w:rFonts w:ascii="Arial" w:hAnsi="Arial"/>
-          <w:b/>
-        </w:rPr>
-        <w:t>que</w:t>
-      </w:r>
-      <w:r>
-        <w:rPr>
-          <w:rFonts w:ascii="Arial" w:hAnsi="Arial"/>
-          <w:b/>
-          <w:spacing w:val="-3"/>
-        </w:rPr>
-        <w:t xml:space="preserve"> </w:t>
-      </w:r>
-      <w:r>
-        <w:rPr>
-          <w:rFonts w:ascii="Arial" w:hAnsi="Arial"/>
-          <w:b/>
-        </w:rPr>
-        <w:t>faz:</w:t>
+        <w:t>Descrição:</w:t>
+      </w:r>
+      <w:r>
+        <w:rPr>
+          <w:rFonts w:ascii="Arial" w:hAnsi="Arial"/>
+          <w:b/>
+          <w:spacing w:val="-3"/>
+        </w:rPr>
+        <w:t xml:space="preserve"/>
+      </w:r>
+      <w:r>
+        <w:rPr>
+          <w:rFonts w:ascii="Arial" w:hAnsi="Arial"/>
+          <w:b/>
+        </w:rPr>
+        <w:t/>
+      </w:r>
+      <w:r>
+        <w:rPr>
+          <w:rFonts w:ascii="Arial" w:hAnsi="Arial"/>
+          <w:b/>
+          <w:spacing w:val="-3"/>
+        </w:rPr>
+        <w:t xml:space="preserve"/>
+      </w:r>
+      <w:r>
+        <w:rPr>
+          <w:rFonts w:ascii="Arial" w:hAnsi="Arial"/>
+          <w:b/>
+        </w:rPr>
+        <w:t/>
       </w:r>
       <w:r>
         <w:rPr>
@@ -2249,37 +2249,37 @@
           <w:rFonts w:ascii="Arial" w:hAnsi="Arial"/>
           <w:b/>
         </w:rPr>
-        <w:t>O</w:t>
-      </w:r>
-      <w:r>
-        <w:rPr>
-          <w:rFonts w:ascii="Arial" w:hAnsi="Arial"/>
-          <w:b/>
-          <w:spacing w:val="-3"/>
-        </w:rPr>
-        <w:t xml:space="preserve"> </w:t>
-      </w:r>
-      <w:r>
-        <w:rPr>
-          <w:rFonts w:ascii="Arial" w:hAnsi="Arial"/>
-          <w:b/>
-        </w:rPr>
-        <w:t>que</w:t>
-      </w:r>
-      <w:r>
-        <w:rPr>
-          <w:rFonts w:ascii="Arial" w:hAnsi="Arial"/>
-          <w:b/>
-          <w:spacing w:val="-3"/>
-        </w:rPr>
-        <w:t xml:space="preserve"> </w:t>
-      </w:r>
-      <w:r>
-        <w:rPr>
-          <w:rFonts w:ascii="Arial" w:hAnsi="Arial"/>
-          <w:b/>
-        </w:rPr>
-        <w:t>faz:</w:t>
+        <w:t>Descrição:</w:t>
+      </w:r>
+      <w:r>
+        <w:rPr>
+          <w:rFonts w:ascii="Arial" w:hAnsi="Arial"/>
+          <w:b/>
+          <w:spacing w:val="-3"/>
+        </w:rPr>
+        <w:t xml:space="preserve"/>
+      </w:r>
+      <w:r>
+        <w:rPr>
+          <w:rFonts w:ascii="Arial" w:hAnsi="Arial"/>
+          <w:b/>
+        </w:rPr>
+        <w:t/>
+      </w:r>
+      <w:r>
+        <w:rPr>
+          <w:rFonts w:ascii="Arial" w:hAnsi="Arial"/>
+          <w:b/>
+          <w:spacing w:val="-3"/>
+        </w:rPr>
+        <w:t xml:space="preserve"/>
+      </w:r>
+      <w:r>
+        <w:rPr>
+          <w:rFonts w:ascii="Arial" w:hAnsi="Arial"/>
+          <w:b/>
+        </w:rPr>
+        <w:t/>
       </w:r>
       <w:r>
         <w:rPr>
@@ -2591,37 +2591,37 @@
           <w:rFonts w:ascii="Arial" w:hAnsi="Arial"/>
           <w:b/>
         </w:rPr>
-        <w:t>O</w:t>
-      </w:r>
-      <w:r>
-        <w:rPr>
-          <w:rFonts w:ascii="Arial" w:hAnsi="Arial"/>
-          <w:b/>
-          <w:spacing w:val="-4"/>
-        </w:rPr>
-        <w:t xml:space="preserve"> </w:t>
-      </w:r>
-      <w:r>
-        <w:rPr>
-          <w:rFonts w:ascii="Arial" w:hAnsi="Arial"/>
-          <w:b/>
-        </w:rPr>
-        <w:t>que</w:t>
-      </w:r>
-      <w:r>
-        <w:rPr>
-          <w:rFonts w:ascii="Arial" w:hAnsi="Arial"/>
-          <w:b/>
-          <w:spacing w:val="-4"/>
-        </w:rPr>
-        <w:t xml:space="preserve"> </w:t>
-      </w:r>
-      <w:r>
-        <w:rPr>
-          <w:rFonts w:ascii="Arial" w:hAnsi="Arial"/>
-          <w:b/>
-        </w:rPr>
-        <w:t>faz:</w:t>
+        <w:t>Descrição:</w:t>
+      </w:r>
+      <w:r>
+        <w:rPr>
+          <w:rFonts w:ascii="Arial" w:hAnsi="Arial"/>
+          <w:b/>
+          <w:spacing w:val="-4"/>
+        </w:rPr>
+        <w:t xml:space="preserve"/>
+      </w:r>
+      <w:r>
+        <w:rPr>
+          <w:rFonts w:ascii="Arial" w:hAnsi="Arial"/>
+          <w:b/>
+        </w:rPr>
+        <w:t/>
+      </w:r>
+      <w:r>
+        <w:rPr>
+          <w:rFonts w:ascii="Arial" w:hAnsi="Arial"/>
+          <w:b/>
+          <w:spacing w:val="-4"/>
+        </w:rPr>
+        <w:t xml:space="preserve"/>
+      </w:r>
+      <w:r>
+        <w:rPr>
+          <w:rFonts w:ascii="Arial" w:hAnsi="Arial"/>
+          <w:b/>
+        </w:rPr>
+        <w:t/>
       </w:r>
       <w:r>
         <w:rPr>
@@ -2980,37 +2980,37 @@
           <w:rFonts w:ascii="Arial" w:hAnsi="Arial"/>
           <w:b/>
         </w:rPr>
-        <w:t>O</w:t>
-      </w:r>
-      <w:r>
-        <w:rPr>
-          <w:rFonts w:ascii="Arial" w:hAnsi="Arial"/>
-          <w:b/>
-          <w:spacing w:val="-3"/>
-        </w:rPr>
-        <w:t xml:space="preserve"> </w:t>
-      </w:r>
-      <w:r>
-        <w:rPr>
-          <w:rFonts w:ascii="Arial" w:hAnsi="Arial"/>
-          <w:b/>
-        </w:rPr>
-        <w:t>que</w:t>
-      </w:r>
-      <w:r>
-        <w:rPr>
-          <w:rFonts w:ascii="Arial" w:hAnsi="Arial"/>
-          <w:b/>
-          <w:spacing w:val="-3"/>
-        </w:rPr>
-        <w:t xml:space="preserve"> </w:t>
-      </w:r>
-      <w:r>
-        <w:rPr>
-          <w:rFonts w:ascii="Arial" w:hAnsi="Arial"/>
-          <w:b/>
-        </w:rPr>
-        <w:t>faz:</w:t>
+        <w:t>Descrição:</w:t>
+      </w:r>
+      <w:r>
+        <w:rPr>
+          <w:rFonts w:ascii="Arial" w:hAnsi="Arial"/>
+          <w:b/>
+          <w:spacing w:val="-3"/>
+        </w:rPr>
+        <w:t xml:space="preserve"/>
+      </w:r>
+      <w:r>
+        <w:rPr>
+          <w:rFonts w:ascii="Arial" w:hAnsi="Arial"/>
+          <w:b/>
+        </w:rPr>
+        <w:t/>
+      </w:r>
+      <w:r>
+        <w:rPr>
+          <w:rFonts w:ascii="Arial" w:hAnsi="Arial"/>
+          <w:b/>
+          <w:spacing w:val="-3"/>
+        </w:rPr>
+        <w:t xml:space="preserve"/>
+      </w:r>
+      <w:r>
+        <w:rPr>
+          <w:rFonts w:ascii="Arial" w:hAnsi="Arial"/>
+          <w:b/>
+        </w:rPr>
+        <w:t/>
       </w:r>
       <w:r>
         <w:rPr>
@@ -3406,37 +3406,37 @@
           <w:rFonts w:ascii="Arial" w:hAnsi="Arial"/>
           <w:b/>
         </w:rPr>
-        <w:t>O</w:t>
-      </w:r>
-      <w:r>
-        <w:rPr>
-          <w:rFonts w:ascii="Arial" w:hAnsi="Arial"/>
-          <w:b/>
-          <w:spacing w:val="-3"/>
-        </w:rPr>
-        <w:t xml:space="preserve"> </w:t>
-      </w:r>
-      <w:r>
-        <w:rPr>
-          <w:rFonts w:ascii="Arial" w:hAnsi="Arial"/>
-          <w:b/>
-        </w:rPr>
-        <w:t>que</w:t>
-      </w:r>
-      <w:r>
-        <w:rPr>
-          <w:rFonts w:ascii="Arial" w:hAnsi="Arial"/>
-          <w:b/>
-          <w:spacing w:val="-3"/>
-        </w:rPr>
-        <w:t xml:space="preserve"> </w:t>
-      </w:r>
-      <w:r>
-        <w:rPr>
-          <w:rFonts w:ascii="Arial" w:hAnsi="Arial"/>
-          <w:b/>
-        </w:rPr>
-        <w:t>faz:</w:t>
+        <w:t>Descrição:</w:t>
+      </w:r>
+      <w:r>
+        <w:rPr>
+          <w:rFonts w:ascii="Arial" w:hAnsi="Arial"/>
+          <w:b/>
+          <w:spacing w:val="-3"/>
+        </w:rPr>
+        <w:t xml:space="preserve"/>
+      </w:r>
+      <w:r>
+        <w:rPr>
+          <w:rFonts w:ascii="Arial" w:hAnsi="Arial"/>
+          <w:b/>
+        </w:rPr>
+        <w:t/>
+      </w:r>
+      <w:r>
+        <w:rPr>
+          <w:rFonts w:ascii="Arial" w:hAnsi="Arial"/>
+          <w:b/>
+          <w:spacing w:val="-3"/>
+        </w:rPr>
+        <w:t xml:space="preserve"/>
+      </w:r>
+      <w:r>
+        <w:rPr>
+          <w:rFonts w:ascii="Arial" w:hAnsi="Arial"/>
+          <w:b/>
+        </w:rPr>
+        <w:t/>
       </w:r>
       <w:r>
         <w:rPr>
@@ -3728,37 +3728,37 @@
           <w:rFonts w:ascii="Arial" w:hAnsi="Arial"/>
           <w:b/>
         </w:rPr>
-        <w:t>O</w:t>
-      </w:r>
-      <w:r>
-        <w:rPr>
-          <w:rFonts w:ascii="Arial" w:hAnsi="Arial"/>
-          <w:b/>
-          <w:spacing w:val="-3"/>
-        </w:rPr>
-        <w:t xml:space="preserve"> </w:t>
-      </w:r>
-      <w:r>
-        <w:rPr>
-          <w:rFonts w:ascii="Arial" w:hAnsi="Arial"/>
-          <w:b/>
-        </w:rPr>
-        <w:t>que</w:t>
-      </w:r>
-      <w:r>
-        <w:rPr>
-          <w:rFonts w:ascii="Arial" w:hAnsi="Arial"/>
-          <w:b/>
-          <w:spacing w:val="-3"/>
-        </w:rPr>
-        <w:t xml:space="preserve"> </w:t>
-      </w:r>
-      <w:r>
-        <w:rPr>
-          <w:rFonts w:ascii="Arial" w:hAnsi="Arial"/>
-          <w:b/>
-        </w:rPr>
-        <w:t>faz:</w:t>
+        <w:t>Descrição:</w:t>
+      </w:r>
+      <w:r>
+        <w:rPr>
+          <w:rFonts w:ascii="Arial" w:hAnsi="Arial"/>
+          <w:b/>
+          <w:spacing w:val="-3"/>
+        </w:rPr>
+        <w:t xml:space="preserve"/>
+      </w:r>
+      <w:r>
+        <w:rPr>
+          <w:rFonts w:ascii="Arial" w:hAnsi="Arial"/>
+          <w:b/>
+        </w:rPr>
+        <w:t/>
+      </w:r>
+      <w:r>
+        <w:rPr>
+          <w:rFonts w:ascii="Arial" w:hAnsi="Arial"/>
+          <w:b/>
+          <w:spacing w:val="-3"/>
+        </w:rPr>
+        <w:t xml:space="preserve"/>
+      </w:r>
+      <w:r>
+        <w:rPr>
+          <w:rFonts w:ascii="Arial" w:hAnsi="Arial"/>
+          <w:b/>
+        </w:rPr>
+        <w:t/>
       </w:r>
       <w:r>
         <w:rPr>
@@ -4038,37 +4038,37 @@
           <w:rFonts w:ascii="Arial" w:hAnsi="Arial"/>
           <w:b/>
         </w:rPr>
-        <w:t>O</w:t>
-      </w:r>
-      <w:r>
-        <w:rPr>
-          <w:rFonts w:ascii="Arial" w:hAnsi="Arial"/>
-          <w:b/>
-          <w:spacing w:val="-4"/>
-        </w:rPr>
-        <w:t xml:space="preserve"> </w:t>
-      </w:r>
-      <w:r>
-        <w:rPr>
-          <w:rFonts w:ascii="Arial" w:hAnsi="Arial"/>
-          <w:b/>
-        </w:rPr>
-        <w:t>que</w:t>
-      </w:r>
-      <w:r>
-        <w:rPr>
-          <w:rFonts w:ascii="Arial" w:hAnsi="Arial"/>
-          <w:b/>
-          <w:spacing w:val="-4"/>
-        </w:rPr>
-        <w:t xml:space="preserve"> </w:t>
-      </w:r>
-      <w:r>
-        <w:rPr>
-          <w:rFonts w:ascii="Arial" w:hAnsi="Arial"/>
-          <w:b/>
-        </w:rPr>
-        <w:t>faz:</w:t>
+        <w:t>Descrição:</w:t>
+      </w:r>
+      <w:r>
+        <w:rPr>
+          <w:rFonts w:ascii="Arial" w:hAnsi="Arial"/>
+          <w:b/>
+          <w:spacing w:val="-4"/>
+        </w:rPr>
+        <w:t xml:space="preserve"/>
+      </w:r>
+      <w:r>
+        <w:rPr>
+          <w:rFonts w:ascii="Arial" w:hAnsi="Arial"/>
+          <w:b/>
+        </w:rPr>
+        <w:t/>
+      </w:r>
+      <w:r>
+        <w:rPr>
+          <w:rFonts w:ascii="Arial" w:hAnsi="Arial"/>
+          <w:b/>
+          <w:spacing w:val="-4"/>
+        </w:rPr>
+        <w:t xml:space="preserve"/>
+      </w:r>
+      <w:r>
+        <w:rPr>
+          <w:rFonts w:ascii="Arial" w:hAnsi="Arial"/>
+          <w:b/>
+        </w:rPr>
+        <w:t/>
       </w:r>
       <w:r>
         <w:rPr>
@@ -4354,37 +4354,37 @@
           <w:rFonts w:ascii="Arial" w:hAnsi="Arial"/>
           <w:b/>
         </w:rPr>
-        <w:t>O</w:t>
-      </w:r>
-      <w:r>
-        <w:rPr>
-          <w:rFonts w:ascii="Arial" w:hAnsi="Arial"/>
-          <w:b/>
-          <w:spacing w:val="-3"/>
-        </w:rPr>
-        <w:t xml:space="preserve"> </w:t>
-      </w:r>
-      <w:r>
-        <w:rPr>
-          <w:rFonts w:ascii="Arial" w:hAnsi="Arial"/>
-          <w:b/>
-        </w:rPr>
-        <w:t>que</w:t>
-      </w:r>
-      <w:r>
-        <w:rPr>
-          <w:rFonts w:ascii="Arial" w:hAnsi="Arial"/>
-          <w:b/>
-          <w:spacing w:val="-3"/>
-        </w:rPr>
-        <w:t xml:space="preserve"> </w:t>
-      </w:r>
-      <w:r>
-        <w:rPr>
-          <w:rFonts w:ascii="Arial" w:hAnsi="Arial"/>
-          <w:b/>
-        </w:rPr>
-        <w:t>faz:</w:t>
+        <w:t>Descrição:</w:t>
+      </w:r>
+      <w:r>
+        <w:rPr>
+          <w:rFonts w:ascii="Arial" w:hAnsi="Arial"/>
+          <w:b/>
+          <w:spacing w:val="-3"/>
+        </w:rPr>
+        <w:t xml:space="preserve"/>
+      </w:r>
+      <w:r>
+        <w:rPr>
+          <w:rFonts w:ascii="Arial" w:hAnsi="Arial"/>
+          <w:b/>
+        </w:rPr>
+        <w:t/>
+      </w:r>
+      <w:r>
+        <w:rPr>
+          <w:rFonts w:ascii="Arial" w:hAnsi="Arial"/>
+          <w:b/>
+          <w:spacing w:val="-3"/>
+        </w:rPr>
+        <w:t xml:space="preserve"/>
+      </w:r>
+      <w:r>
+        <w:rPr>
+          <w:rFonts w:ascii="Arial" w:hAnsi="Arial"/>
+          <w:b/>
+        </w:rPr>
+        <w:t/>
       </w:r>
       <w:r>
         <w:rPr>
@@ -4696,7 +4696,7 @@
           <w:rFonts w:ascii="Arial" w:hAnsi="Arial"/>
           <w:b/>
         </w:rPr>
-        <w:t xml:space="preserve">O que faz: </w:t>
+        <w:t xml:space="preserve">Descrição: </w:t>
       </w:r>
       <w:r>
         <w:t xml:space="preserve">cadastra, edita, busca e ativa/inativa organizações </w:t>
@@ -5031,7 +5031,7 @@
           <w:rFonts w:ascii="Arial" w:hAnsi="Arial"/>
           <w:b/>
         </w:rPr>
-        <w:t xml:space="preserve">O que faz: </w:t>
+        <w:t xml:space="preserve">Descrição: </w:t>
       </w:r>
       <w:r>
         <w:t xml:space="preserve">mantém campanhas por cliente, canal e objetivo, com busca, edição e ativação. </w:t>
@@ -5298,37 +5298,37 @@
           <w:rFonts w:ascii="Arial" w:hAnsi="Arial"/>
           <w:b/>
         </w:rPr>
-        <w:t>O</w:t>
-      </w:r>
-      <w:r>
-        <w:rPr>
-          <w:rFonts w:ascii="Arial" w:hAnsi="Arial"/>
-          <w:b/>
-          <w:spacing w:val="-3"/>
-        </w:rPr>
-        <w:t xml:space="preserve"> </w:t>
-      </w:r>
-      <w:r>
-        <w:rPr>
-          <w:rFonts w:ascii="Arial" w:hAnsi="Arial"/>
-          <w:b/>
-        </w:rPr>
-        <w:t>que</w:t>
-      </w:r>
-      <w:r>
-        <w:rPr>
-          <w:rFonts w:ascii="Arial" w:hAnsi="Arial"/>
-          <w:b/>
-          <w:spacing w:val="-3"/>
-        </w:rPr>
-        <w:t xml:space="preserve"> </w:t>
-      </w:r>
-      <w:r>
-        <w:rPr>
-          <w:rFonts w:ascii="Arial" w:hAnsi="Arial"/>
-          <w:b/>
-        </w:rPr>
-        <w:t>faz:</w:t>
+        <w:t>Descrição:</w:t>
+      </w:r>
+      <w:r>
+        <w:rPr>
+          <w:rFonts w:ascii="Arial" w:hAnsi="Arial"/>
+          <w:b/>
+          <w:spacing w:val="-3"/>
+        </w:rPr>
+        <w:t xml:space="preserve"/>
+      </w:r>
+      <w:r>
+        <w:rPr>
+          <w:rFonts w:ascii="Arial" w:hAnsi="Arial"/>
+          <w:b/>
+        </w:rPr>
+        <w:t/>
+      </w:r>
+      <w:r>
+        <w:rPr>
+          <w:rFonts w:ascii="Arial" w:hAnsi="Arial"/>
+          <w:b/>
+          <w:spacing w:val="-3"/>
+        </w:rPr>
+        <w:t xml:space="preserve"/>
+      </w:r>
+      <w:r>
+        <w:rPr>
+          <w:rFonts w:ascii="Arial" w:hAnsi="Arial"/>
+          <w:b/>
+        </w:rPr>
+        <w:t/>
       </w:r>
       <w:r>
         <w:rPr>
@@ -5644,7 +5644,7 @@
           <w:rFonts w:ascii="Arial" w:hAnsi="Arial"/>
           <w:b/>
         </w:rPr>
-        <w:t xml:space="preserve">O que faz: </w:t>
+        <w:t xml:space="preserve">Descrição: </w:t>
       </w:r>
       <w:r>
         <w:t xml:space="preserve">mantém calendários, prazos e regras de precedência por cliente, tipo ou padrão. </w:t>
@@ -5920,7 +5920,7 @@
           <w:rFonts w:ascii="Arial" w:hAnsi="Arial"/>
           <w:b/>
         </w:rPr>
-        <w:t xml:space="preserve">O que faz: </w:t>
+        <w:t xml:space="preserve">Descrição: </w:t>
       </w:r>
       <w:r>
         <w:t xml:space="preserve">administra usuários, e-mails, papéis, vínculo com clientes e situação de </w:t>

</xml_diff>